<commit_message>
style: updated cover pages, set corner-to-corner headers/footers, and removed wireframe collage
</commit_message>
<xml_diff>
--- a/Practical File/Practical-1-2-Complete-Lab-Report-25DCS058.docx
+++ b/Practical File/Practical-1-2-Complete-Lab-Report-25DCS058.docx
@@ -111,7 +111,7 @@
     </w:p>
     <w:p>
       <w:pPr>
-        <w:spacing w:after="240"/>
+        <w:spacing w:after="120"/>
         <w:jc w:val="center"/>
       </w:pPr>
       <w:r>
@@ -121,15 +121,31 @@
           <w:i w:val="0"/>
           <w:color w:val="1B365D"/>
           <w:sz w:val="48"/>
+          <w:u w:val="none"/>
         </w:rPr>
         <w:t>WEB DEVELOPMENT FRAMEWORKS</w:t>
-        <w:br/>
+      </w:r>
+    </w:p>
+    <w:p>
+      <w:pPr>
+        <w:spacing w:after="280"/>
+        <w:jc w:val="center"/>
+      </w:pPr>
+      <w:r>
+        <w:rPr>
+          <w:rFonts w:ascii="Calibri" w:hAnsi="Calibri"/>
+          <w:b/>
+          <w:i w:val="0"/>
+          <w:color w:val="1B365D"/>
+          <w:sz w:val="40"/>
+          <w:u w:val="single"/>
+        </w:rPr>
         <w:t>(ITUE203)</w:t>
       </w:r>
     </w:p>
     <w:p>
       <w:pPr>
-        <w:spacing w:after="800"/>
+        <w:spacing w:after="1200"/>
         <w:jc w:val="center"/>
       </w:pPr>
       <w:r>
@@ -138,21 +154,11 @@
           <w:b/>
           <w:i w:val="0"/>
           <w:color w:val="475569"/>
-          <w:sz w:val="30"/>
+          <w:sz w:val="27"/>
+          <w:u w:val="none"/>
         </w:rPr>
-        <w:t>COMBINED LAB PRACTICAL PORTFOLIO</w:t>
-        <w:br/>
-        <w:t>(PRACTICALS 1 &amp; 2)</w:t>
+        <w:t>COMBINED LAB PRACTICAL PORTFOLIO (PRACTICALS 1 - 2)</w:t>
       </w:r>
-    </w:p>
-    <w:p>
-      <w:pPr>
-        <w:spacing w:after="800"/>
-        <w:jc w:val="center"/>
-        <w:pBdr>
-          <w:bottom w:val="single" w:sz="18" w:space="1" w:color="1B365D"/>
-        </w:pBdr>
-      </w:pPr>
     </w:p>
     <w:p>
       <w:pPr>
@@ -165,7 +171,8 @@
           <w:b w:val="0"/>
           <w:i/>
           <w:color w:val="64748B"/>
-          <w:sz w:val="24"/>
+          <w:sz w:val="22"/>
+          <w:u w:val="none"/>
         </w:rPr>
         <w:t>Submitted By:</w:t>
       </w:r>
@@ -181,7 +188,8 @@
           <w:b/>
           <w:i w:val="0"/>
           <w:color w:val="0F172A"/>
-          <w:sz w:val="26"/>
+          <w:sz w:val="24"/>
+          <w:u w:val="none"/>
         </w:rPr>
         <w:t>Name: RUDRA | Enrollment ID: 25DCS058</w:t>
       </w:r>
@@ -197,7 +205,8 @@
           <w:b w:val="0"/>
           <w:i w:val="0"/>
           <w:color w:val="475569"/>
-          <w:sz w:val="22"/>
+          <w:sz w:val="21"/>
+          <w:u w:val="none"/>
         </w:rPr>
         <w:t>Devang Patel Institute of Advance Technology &amp; Research (DEPSTAR)</w:t>
       </w:r>
@@ -213,7 +222,8 @@
           <w:b w:val="0"/>
           <w:i w:val="0"/>
           <w:color w:val="475569"/>
-          <w:sz w:val="22"/>
+          <w:sz w:val="21"/>
+          <w:u w:val="none"/>
         </w:rPr>
         <w:t>Charotar University of Science and Technology (CHARUSAT)</w:t>
       </w:r>
@@ -236,6 +246,7 @@
           <w:i w:val="0"/>
           <w:color w:val="1B365D"/>
           <w:sz w:val="36"/>
+          <w:u w:val="none"/>
         </w:rPr>
         <w:t>PRACTICAL NO: 1</w:t>
       </w:r>
@@ -253,6 +264,7 @@
           <w:i w:val="0"/>
           <w:color w:val="475569"/>
           <w:sz w:val="26"/>
+          <w:u w:val="none"/>
         </w:rPr>
         <w:t>AIM</w:t>
       </w:r>
@@ -268,6 +280,7 @@
           <w:i w:val="0"/>
           <w:color w:val="334155"/>
           <w:sz w:val="22"/>
+          <w:u w:val="none"/>
         </w:rPr>
         <w:t>Project Initiation, Requirement Analysis, Sitemap, Wireframe, and GitHub Setup</w:t>
       </w:r>
@@ -285,6 +298,7 @@
           <w:i w:val="0"/>
           <w:color w:val="475569"/>
           <w:sz w:val="26"/>
+          <w:u w:val="none"/>
         </w:rPr>
         <w:t>PROBLEM DEFINITION</w:t>
       </w:r>
@@ -300,6 +314,7 @@
           <w:i w:val="0"/>
           <w:color w:val="334155"/>
           <w:sz w:val="22"/>
+          <w:u w:val="none"/>
         </w:rPr>
         <w:t>Initiate the semester-long StudentHub portal by identifying the problem scope, user roles, key modules, navigation flow, and minimum 10 pages. Create a sitemap, low-fidelity wireframe, project folder structure, README file, and GitHub repository.</w:t>
       </w:r>
@@ -317,6 +332,7 @@
           <w:i w:val="0"/>
           <w:color w:val="475569"/>
           <w:sz w:val="26"/>
+          <w:u w:val="none"/>
         </w:rPr>
         <w:t>KEY QUESTIONS &amp; INTERPRETATION</w:t>
       </w:r>
@@ -332,6 +348,7 @@
           <w:i w:val="0"/>
           <w:color w:val="334155"/>
           <w:sz w:val="22"/>
+          <w:u w:val="none"/>
         </w:rPr>
         <w:t>Q1: What is URL and parts of URL?</w:t>
         <w:br/>
@@ -365,6 +382,7 @@
           <w:i w:val="0"/>
           <w:color w:val="334155"/>
           <w:sz w:val="22"/>
+          <w:u w:val="none"/>
         </w:rPr>
         <w:t>Q2: How does HTML file processed in web browser?</w:t>
         <w:br/>
@@ -392,6 +410,7 @@
           <w:i w:val="0"/>
           <w:color w:val="334155"/>
           <w:sz w:val="22"/>
+          <w:u w:val="none"/>
         </w:rPr>
         <w:t>Q3: How will page navigation flow managed among all HTML pages?</w:t>
         <w:br/>
@@ -409,6 +428,7 @@
           <w:i w:val="0"/>
           <w:color w:val="334155"/>
           <w:sz w:val="22"/>
+          <w:u w:val="none"/>
         </w:rPr>
         <w:t>Q4: How will GitHub commits be maintained after each practical?</w:t>
         <w:br/>
@@ -436,6 +456,7 @@
           <w:i w:val="0"/>
           <w:color w:val="475569"/>
           <w:sz w:val="26"/>
+          <w:u w:val="none"/>
         </w:rPr>
         <w:t>PROJECT DIRECTORY STRUCTURE &amp; SITEMAP HIERARCHY</w:t>
       </w:r>
@@ -451,6 +472,7 @@
           <w:i w:val="0"/>
           <w:color w:val="334155"/>
           <w:sz w:val="22"/>
+          <w:u w:val="none"/>
         </w:rPr>
         <w:t>The StudentHub portal folder structure created for the initial implementation:</w:t>
       </w:r>
@@ -488,6 +510,7 @@
                 <w:i w:val="0"/>
                 <w:color w:val="0F172A"/>
                 <w:sz w:val="18"/>
+                <w:u w:val="none"/>
               </w:rPr>
               <w:t>Web Development/</w:t>
               <w:br/>
@@ -548,6 +571,7 @@
           <w:i w:val="0"/>
           <w:color w:val="475569"/>
           <w:sz w:val="26"/>
+          <w:u w:val="none"/>
         </w:rPr>
         <w:t>OUTPUT SCREENSHOTS &amp; PASTING INSTRUCTIONS</w:t>
       </w:r>
@@ -565,6 +589,7 @@
           <w:i w:val="0"/>
           <w:color w:val="64748B"/>
           <w:sz w:val="22"/>
+          <w:u w:val="none"/>
         </w:rPr>
         <w:t>Output Slot: Sitemap Diagram</w:t>
       </w:r>
@@ -644,6 +669,7 @@
           <w:i/>
           <w:color w:val="64748B"/>
           <w:sz w:val="19"/>
+          <w:u w:val="none"/>
         </w:rPr>
         <w:t>Figure: Visual Site Sitemap Design Hierarchy</w:t>
       </w:r>
@@ -661,8 +687,27 @@
           <w:i w:val="0"/>
           <w:color w:val="64748B"/>
           <w:sz w:val="22"/>
+          <w:u w:val="none"/>
         </w:rPr>
-        <w:t>Output Slot: Low-Fidelity Wireframes Collage</w:t>
+        <w:t>Output Slot: Individual Wireframes (All 11 Pages)</w:t>
+      </w:r>
+    </w:p>
+    <w:p>
+      <w:pPr>
+        <w:pStyle w:val="Heading3"/>
+        <w:keepNext/>
+        <w:spacing w:before="240" w:after="120"/>
+      </w:pPr>
+      <w:r>
+        <w:rPr>
+          <w:rFonts w:ascii="Calibri Light" w:hAnsi="Calibri Light"/>
+          <w:b/>
+          <w:i w:val="0"/>
+          <w:color w:val="64748B"/>
+          <w:sz w:val="22"/>
+          <w:u w:val="none"/>
+        </w:rPr>
+        <w:t>Wireframe: Home Page</w:t>
       </w:r>
     </w:p>
     <w:tbl>
@@ -693,7 +738,7 @@
             <w:r>
               <w:drawing>
                 <wp:inline xmlns:a="http://schemas.openxmlformats.org/drawingml/2006/main" xmlns:pic="http://schemas.openxmlformats.org/drawingml/2006/picture">
-                  <wp:extent cx="5303520" cy="9736931"/>
+                  <wp:extent cx="5303520" cy="7292340"/>
                   <wp:docPr id="4" name="Picture 4"/>
                   <wp:cNvGraphicFramePr>
                     <a:graphicFrameLocks noChangeAspect="1"/>
@@ -702,7 +747,7 @@
                     <a:graphicData uri="http://schemas.openxmlformats.org/drawingml/2006/picture">
                       <pic:pic>
                         <pic:nvPicPr>
-                          <pic:cNvPr id="0" name="studenthub_all_11_wireframes.png"/>
+                          <pic:cNvPr id="0" name="01_index_wireframe.png"/>
                           <pic:cNvPicPr/>
                         </pic:nvPicPr>
                         <pic:blipFill>
@@ -714,7 +759,7 @@
                         <pic:spPr>
                           <a:xfrm>
                             <a:off x="0" y="0"/>
-                            <a:ext cx="5303520" cy="9736931"/>
+                            <a:ext cx="5303520" cy="7292340"/>
                           </a:xfrm>
                           <a:prstGeom prst="rect"/>
                         </pic:spPr>
@@ -740,8 +785,9 @@
           <w:i/>
           <w:color w:val="64748B"/>
           <w:sz w:val="19"/>
+          <w:u w:val="none"/>
         </w:rPr>
-        <w:t>Figure: Low-Fidelity Visual Wireframe Collage</w:t>
+        <w:t>Figure: Wireframe layout of Home Page</w:t>
       </w:r>
     </w:p>
     <w:p>
@@ -757,25 +803,9 @@
           <w:i w:val="0"/>
           <w:color w:val="64748B"/>
           <w:sz w:val="22"/>
+          <w:u w:val="none"/>
         </w:rPr>
-        <w:t>Output Slot: Individual Wireframes (All 11 Pages)</w:t>
-      </w:r>
-    </w:p>
-    <w:p>
-      <w:pPr>
-        <w:pStyle w:val="Heading3"/>
-        <w:keepNext/>
-        <w:spacing w:before="240" w:after="120"/>
-      </w:pPr>
-      <w:r>
-        <w:rPr>
-          <w:rFonts w:ascii="Calibri Light" w:hAnsi="Calibri Light"/>
-          <w:b/>
-          <w:i w:val="0"/>
-          <w:color w:val="64748B"/>
-          <w:sz w:val="22"/>
-        </w:rPr>
-        <w:t>Wireframe: Home Page</w:t>
+        <w:t>Wireframe: About Us Page</w:t>
       </w:r>
     </w:p>
     <w:tbl>
@@ -815,7 +845,7 @@
                     <a:graphicData uri="http://schemas.openxmlformats.org/drawingml/2006/picture">
                       <pic:pic>
                         <pic:nvPicPr>
-                          <pic:cNvPr id="0" name="01_index_wireframe.png"/>
+                          <pic:cNvPr id="0" name="02_about_wireframe.png"/>
                           <pic:cNvPicPr/>
                         </pic:nvPicPr>
                         <pic:blipFill>
@@ -853,8 +883,9 @@
           <w:i/>
           <w:color w:val="64748B"/>
           <w:sz w:val="19"/>
+          <w:u w:val="none"/>
         </w:rPr>
-        <w:t>Figure: Wireframe layout of Home Page</w:t>
+        <w:t>Figure: Wireframe layout of About Us Page</w:t>
       </w:r>
     </w:p>
     <w:p>
@@ -870,8 +901,9 @@
           <w:i w:val="0"/>
           <w:color w:val="64748B"/>
           <w:sz w:val="22"/>
+          <w:u w:val="none"/>
         </w:rPr>
-        <w:t>Wireframe: About Us Page</w:t>
+        <w:t>Wireframe: Student Registration Page</w:t>
       </w:r>
     </w:p>
     <w:tbl>
@@ -911,7 +943,7 @@
                     <a:graphicData uri="http://schemas.openxmlformats.org/drawingml/2006/picture">
                       <pic:pic>
                         <pic:nvPicPr>
-                          <pic:cNvPr id="0" name="02_about_wireframe.png"/>
+                          <pic:cNvPr id="0" name="03_register_wireframe.png"/>
                           <pic:cNvPicPr/>
                         </pic:nvPicPr>
                         <pic:blipFill>
@@ -949,8 +981,9 @@
           <w:i/>
           <w:color w:val="64748B"/>
           <w:sz w:val="19"/>
+          <w:u w:val="none"/>
         </w:rPr>
-        <w:t>Figure: Wireframe layout of About Us Page</w:t>
+        <w:t>Figure: Wireframe layout of Student Registration Page</w:t>
       </w:r>
     </w:p>
     <w:p>
@@ -966,8 +999,9 @@
           <w:i w:val="0"/>
           <w:color w:val="64748B"/>
           <w:sz w:val="22"/>
+          <w:u w:val="none"/>
         </w:rPr>
-        <w:t>Wireframe: Student Registration Page</w:t>
+        <w:t>Wireframe: User Login Page</w:t>
       </w:r>
     </w:p>
     <w:tbl>
@@ -1007,7 +1041,7 @@
                     <a:graphicData uri="http://schemas.openxmlformats.org/drawingml/2006/picture">
                       <pic:pic>
                         <pic:nvPicPr>
-                          <pic:cNvPr id="0" name="03_register_wireframe.png"/>
+                          <pic:cNvPr id="0" name="04_login_wireframe.png"/>
                           <pic:cNvPicPr/>
                         </pic:nvPicPr>
                         <pic:blipFill>
@@ -1045,8 +1079,9 @@
           <w:i/>
           <w:color w:val="64748B"/>
           <w:sz w:val="19"/>
+          <w:u w:val="none"/>
         </w:rPr>
-        <w:t>Figure: Wireframe layout of Student Registration Page</w:t>
+        <w:t>Figure: Wireframe layout of User Login Page</w:t>
       </w:r>
     </w:p>
     <w:p>
@@ -1062,8 +1097,9 @@
           <w:i w:val="0"/>
           <w:color w:val="64748B"/>
           <w:sz w:val="22"/>
+          <w:u w:val="none"/>
         </w:rPr>
-        <w:t>Wireframe: User Login Page</w:t>
+        <w:t>Wireframe: Student Dashboard Page</w:t>
       </w:r>
     </w:p>
     <w:tbl>
@@ -1103,7 +1139,7 @@
                     <a:graphicData uri="http://schemas.openxmlformats.org/drawingml/2006/picture">
                       <pic:pic>
                         <pic:nvPicPr>
-                          <pic:cNvPr id="0" name="04_login_wireframe.png"/>
+                          <pic:cNvPr id="0" name="05_dashboard_wireframe.png"/>
                           <pic:cNvPicPr/>
                         </pic:nvPicPr>
                         <pic:blipFill>
@@ -1141,8 +1177,9 @@
           <w:i/>
           <w:color w:val="64748B"/>
           <w:sz w:val="19"/>
+          <w:u w:val="none"/>
         </w:rPr>
-        <w:t>Figure: Wireframe layout of User Login Page</w:t>
+        <w:t>Figure: Wireframe layout of Student Dashboard Page</w:t>
       </w:r>
     </w:p>
     <w:p>
@@ -1158,8 +1195,9 @@
           <w:i w:val="0"/>
           <w:color w:val="64748B"/>
           <w:sz w:val="22"/>
+          <w:u w:val="none"/>
         </w:rPr>
-        <w:t>Wireframe: Student Dashboard Page</w:t>
+        <w:t>Wireframe: Campus Events Page</w:t>
       </w:r>
     </w:p>
     <w:tbl>
@@ -1199,7 +1237,7 @@
                     <a:graphicData uri="http://schemas.openxmlformats.org/drawingml/2006/picture">
                       <pic:pic>
                         <pic:nvPicPr>
-                          <pic:cNvPr id="0" name="05_dashboard_wireframe.png"/>
+                          <pic:cNvPr id="0" name="06_events_wireframe.png"/>
                           <pic:cNvPicPr/>
                         </pic:nvPicPr>
                         <pic:blipFill>
@@ -1237,8 +1275,9 @@
           <w:i/>
           <w:color w:val="64748B"/>
           <w:sz w:val="19"/>
+          <w:u w:val="none"/>
         </w:rPr>
-        <w:t>Figure: Wireframe layout of Student Dashboard Page</w:t>
+        <w:t>Figure: Wireframe layout of Campus Events Page</w:t>
       </w:r>
     </w:p>
     <w:p>
@@ -1254,8 +1293,9 @@
           <w:i w:val="0"/>
           <w:color w:val="64748B"/>
           <w:sz w:val="22"/>
+          <w:u w:val="none"/>
         </w:rPr>
-        <w:t>Wireframe: Campus Events Page</w:t>
+        <w:t>Wireframe: Student Profile Page</w:t>
       </w:r>
     </w:p>
     <w:tbl>
@@ -1295,7 +1335,7 @@
                     <a:graphicData uri="http://schemas.openxmlformats.org/drawingml/2006/picture">
                       <pic:pic>
                         <pic:nvPicPr>
-                          <pic:cNvPr id="0" name="06_events_wireframe.png"/>
+                          <pic:cNvPr id="0" name="07_profile_wireframe.png"/>
                           <pic:cNvPicPr/>
                         </pic:nvPicPr>
                         <pic:blipFill>
@@ -1333,8 +1373,9 @@
           <w:i/>
           <w:color w:val="64748B"/>
           <w:sz w:val="19"/>
+          <w:u w:val="none"/>
         </w:rPr>
-        <w:t>Figure: Wireframe layout of Campus Events Page</w:t>
+        <w:t>Figure: Wireframe layout of Student Profile Page</w:t>
       </w:r>
     </w:p>
     <w:p>
@@ -1350,8 +1391,9 @@
           <w:i w:val="0"/>
           <w:color w:val="64748B"/>
           <w:sz w:val="22"/>
+          <w:u w:val="none"/>
         </w:rPr>
-        <w:t>Wireframe: Student Profile Page</w:t>
+        <w:t>Wireframe: Contact Support Page</w:t>
       </w:r>
     </w:p>
     <w:tbl>
@@ -1391,7 +1433,7 @@
                     <a:graphicData uri="http://schemas.openxmlformats.org/drawingml/2006/picture">
                       <pic:pic>
                         <pic:nvPicPr>
-                          <pic:cNvPr id="0" name="07_profile_wireframe.png"/>
+                          <pic:cNvPr id="0" name="08_contact_wireframe.png"/>
                           <pic:cNvPicPr/>
                         </pic:nvPicPr>
                         <pic:blipFill>
@@ -1429,8 +1471,9 @@
           <w:i/>
           <w:color w:val="64748B"/>
           <w:sz w:val="19"/>
+          <w:u w:val="none"/>
         </w:rPr>
-        <w:t>Figure: Wireframe layout of Student Profile Page</w:t>
+        <w:t>Figure: Wireframe layout of Contact Support Page</w:t>
       </w:r>
     </w:p>
     <w:p>
@@ -1446,8 +1489,9 @@
           <w:i w:val="0"/>
           <w:color w:val="64748B"/>
           <w:sz w:val="22"/>
+          <w:u w:val="none"/>
         </w:rPr>
-        <w:t>Wireframe: Contact Support Page</w:t>
+        <w:t>Wireframe: Admin Portal Page</w:t>
       </w:r>
     </w:p>
     <w:tbl>
@@ -1487,7 +1531,7 @@
                     <a:graphicData uri="http://schemas.openxmlformats.org/drawingml/2006/picture">
                       <pic:pic>
                         <pic:nvPicPr>
-                          <pic:cNvPr id="0" name="08_contact_wireframe.png"/>
+                          <pic:cNvPr id="0" name="09_admin_wireframe.png"/>
                           <pic:cNvPicPr/>
                         </pic:nvPicPr>
                         <pic:blipFill>
@@ -1525,8 +1569,9 @@
           <w:i/>
           <w:color w:val="64748B"/>
           <w:sz w:val="19"/>
+          <w:u w:val="none"/>
         </w:rPr>
-        <w:t>Figure: Wireframe layout of Contact Support Page</w:t>
+        <w:t>Figure: Wireframe layout of Admin Portal Page</w:t>
       </w:r>
     </w:p>
     <w:p>
@@ -1542,8 +1587,9 @@
           <w:i w:val="0"/>
           <w:color w:val="64748B"/>
           <w:sz w:val="22"/>
+          <w:u w:val="none"/>
         </w:rPr>
-        <w:t>Wireframe: Admin Portal Page</w:t>
+        <w:t>Wireframe: FAQ Page</w:t>
       </w:r>
     </w:p>
     <w:tbl>
@@ -1583,7 +1629,7 @@
                     <a:graphicData uri="http://schemas.openxmlformats.org/drawingml/2006/picture">
                       <pic:pic>
                         <pic:nvPicPr>
-                          <pic:cNvPr id="0" name="09_admin_wireframe.png"/>
+                          <pic:cNvPr id="0" name="10_faq_wireframe.png"/>
                           <pic:cNvPicPr/>
                         </pic:nvPicPr>
                         <pic:blipFill>
@@ -1621,8 +1667,9 @@
           <w:i/>
           <w:color w:val="64748B"/>
           <w:sz w:val="19"/>
+          <w:u w:val="none"/>
         </w:rPr>
-        <w:t>Figure: Wireframe layout of Admin Portal Page</w:t>
+        <w:t>Figure: Wireframe layout of FAQ Page</w:t>
       </w:r>
     </w:p>
     <w:p>
@@ -1638,8 +1685,9 @@
           <w:i w:val="0"/>
           <w:color w:val="64748B"/>
           <w:sz w:val="22"/>
+          <w:u w:val="none"/>
         </w:rPr>
-        <w:t>Wireframe: FAQ Page</w:t>
+        <w:t>Wireframe: Feedback Survey Page</w:t>
       </w:r>
     </w:p>
     <w:tbl>
@@ -1679,7 +1727,7 @@
                     <a:graphicData uri="http://schemas.openxmlformats.org/drawingml/2006/picture">
                       <pic:pic>
                         <pic:nvPicPr>
-                          <pic:cNvPr id="0" name="10_faq_wireframe.png"/>
+                          <pic:cNvPr id="0" name="11_feedback_wireframe.png"/>
                           <pic:cNvPicPr/>
                         </pic:nvPicPr>
                         <pic:blipFill>
@@ -1717,102 +1765,7 @@
           <w:i/>
           <w:color w:val="64748B"/>
           <w:sz w:val="19"/>
-        </w:rPr>
-        <w:t>Figure: Wireframe layout of FAQ Page</w:t>
-      </w:r>
-    </w:p>
-    <w:p>
-      <w:pPr>
-        <w:pStyle w:val="Heading3"/>
-        <w:keepNext/>
-        <w:spacing w:before="240" w:after="120"/>
-      </w:pPr>
-      <w:r>
-        <w:rPr>
-          <w:rFonts w:ascii="Calibri Light" w:hAnsi="Calibri Light"/>
-          <w:b/>
-          <w:i w:val="0"/>
-          <w:color w:val="64748B"/>
-          <w:sz w:val="22"/>
-        </w:rPr>
-        <w:t>Wireframe: Feedback Survey Page</w:t>
-      </w:r>
-    </w:p>
-    <w:tbl>
-      <w:tblPr>
-        <w:tblW w:type="auto" w:w="0"/>
-        <w:jc w:val="center"/>
-        <w:tblLook w:firstColumn="1" w:firstRow="1" w:lastColumn="0" w:lastRow="0" w:noHBand="0" w:noVBand="1" w:val="04A0"/>
-      </w:tblPr>
-      <w:tblGrid>
-        <w:gridCol w:w="9360"/>
-      </w:tblGrid>
-      <w:tr>
-        <w:tc>
-          <w:tcPr>
-            <w:tcW w:type="dxa" w:w="9360"/>
-            <w:tcBorders>
-              <w:top w:val="single" w:sz="4" w:space="0" w:color="F1F5F9"/>
-              <w:left w:val="single" w:sz="4" w:space="0" w:color="F1F5F9"/>
-              <w:bottom w:val="single" w:sz="4" w:space="0" w:color="F1F5F9"/>
-              <w:right w:val="single" w:sz="4" w:space="0" w:color="F1F5F9"/>
-            </w:tcBorders>
-          </w:tcPr>
-          <w:p>
-            <w:pPr>
-              <w:spacing w:before="160" w:after="160"/>
-              <w:jc w:val="center"/>
-            </w:pPr>
-            <w:r>
-              <w:drawing>
-                <wp:inline xmlns:a="http://schemas.openxmlformats.org/drawingml/2006/main" xmlns:pic="http://schemas.openxmlformats.org/drawingml/2006/picture">
-                  <wp:extent cx="5303520" cy="7292340"/>
-                  <wp:docPr id="15" name="Picture 15"/>
-                  <wp:cNvGraphicFramePr>
-                    <a:graphicFrameLocks noChangeAspect="1"/>
-                  </wp:cNvGraphicFramePr>
-                  <a:graphic>
-                    <a:graphicData uri="http://schemas.openxmlformats.org/drawingml/2006/picture">
-                      <pic:pic>
-                        <pic:nvPicPr>
-                          <pic:cNvPr id="0" name="11_feedback_wireframe.png"/>
-                          <pic:cNvPicPr/>
-                        </pic:nvPicPr>
-                        <pic:blipFill>
-                          <a:blip r:embed="rId25"/>
-                          <a:stretch>
-                            <a:fillRect/>
-                          </a:stretch>
-                        </pic:blipFill>
-                        <pic:spPr>
-                          <a:xfrm>
-                            <a:off x="0" y="0"/>
-                            <a:ext cx="5303520" cy="7292340"/>
-                          </a:xfrm>
-                          <a:prstGeom prst="rect"/>
-                        </pic:spPr>
-                      </pic:pic>
-                    </a:graphicData>
-                  </a:graphic>
-                </wp:inline>
-              </w:drawing>
-            </w:r>
-          </w:p>
-        </w:tc>
-      </w:tr>
-    </w:tbl>
-    <w:p>
-      <w:pPr>
-        <w:spacing w:before="80" w:after="240"/>
-        <w:jc w:val="center"/>
-      </w:pPr>
-      <w:r>
-        <w:rPr>
-          <w:rFonts w:ascii="Calibri" w:hAnsi="Calibri"/>
-          <w:b w:val="0"/>
-          <w:i/>
-          <w:color w:val="64748B"/>
-          <w:sz w:val="19"/>
+          <w:u w:val="none"/>
         </w:rPr>
         <w:t>Figure: Wireframe layout of Feedback Survey Page</w:t>
       </w:r>
@@ -1830,6 +1783,7 @@
           <w:i w:val="0"/>
           <w:color w:val="64748B"/>
           <w:sz w:val="22"/>
+          <w:u w:val="none"/>
         </w:rPr>
         <w:t>Output Slot: GitHub Repository &amp; Commits Layout</w:t>
       </w:r>
@@ -1863,7 +1817,7 @@
               <w:drawing>
                 <wp:inline xmlns:a="http://schemas.openxmlformats.org/drawingml/2006/main" xmlns:pic="http://schemas.openxmlformats.org/drawingml/2006/picture">
                   <wp:extent cx="5303520" cy="4242816"/>
-                  <wp:docPr id="16" name="Picture 16"/>
+                  <wp:docPr id="15" name="Picture 15"/>
                   <wp:cNvGraphicFramePr>
                     <a:graphicFrameLocks noChangeAspect="1"/>
                   </wp:cNvGraphicFramePr>
@@ -1875,7 +1829,7 @@
                           <pic:cNvPicPr/>
                         </pic:nvPicPr>
                         <pic:blipFill>
-                          <a:blip r:embed="rId26"/>
+                          <a:blip r:embed="rId25"/>
                           <a:stretch>
                             <a:fillRect/>
                           </a:stretch>
@@ -1909,6 +1863,7 @@
           <w:i/>
           <w:color w:val="64748B"/>
           <w:sz w:val="19"/>
+          <w:u w:val="none"/>
         </w:rPr>
         <w:t>Figure: Live GitHub Repository Landing Page with Pushed Commits</w:t>
       </w:r>
@@ -1926,6 +1881,7 @@
           <w:i w:val="0"/>
           <w:color w:val="64748B"/>
           <w:sz w:val="22"/>
+          <w:u w:val="none"/>
         </w:rPr>
         <w:t>Output Slot: IDE Explorer Project Directory Layout</w:t>
       </w:r>
@@ -1959,7 +1915,7 @@
               <w:drawing>
                 <wp:inline xmlns:a="http://schemas.openxmlformats.org/drawingml/2006/main" xmlns:pic="http://schemas.openxmlformats.org/drawingml/2006/picture">
                   <wp:extent cx="5303520" cy="5303520"/>
-                  <wp:docPr id="17" name="Picture 17"/>
+                  <wp:docPr id="16" name="Picture 16"/>
                   <wp:cNvGraphicFramePr>
                     <a:graphicFrameLocks noChangeAspect="1"/>
                   </wp:cNvGraphicFramePr>
@@ -1971,7 +1927,7 @@
                           <pic:cNvPicPr/>
                         </pic:nvPicPr>
                         <pic:blipFill>
-                          <a:blip r:embed="rId27"/>
+                          <a:blip r:embed="rId26"/>
                           <a:stretch>
                             <a:fillRect/>
                           </a:stretch>
@@ -2005,6 +1961,7 @@
           <w:i/>
           <w:color w:val="64748B"/>
           <w:sz w:val="19"/>
+          <w:u w:val="none"/>
         </w:rPr>
         <w:t>Figure: VS Code IDE Workspace File Explorer Tree</w:t>
       </w:r>
@@ -2027,6 +1984,7 @@
           <w:i w:val="0"/>
           <w:color w:val="1B365D"/>
           <w:sz w:val="36"/>
+          <w:u w:val="none"/>
         </w:rPr>
         <w:t>PRACTICAL NO: 2</w:t>
       </w:r>
@@ -2044,6 +2002,7 @@
           <w:i w:val="0"/>
           <w:color w:val="475569"/>
           <w:sz w:val="26"/>
+          <w:u w:val="none"/>
         </w:rPr>
         <w:t>AIM</w:t>
       </w:r>
@@ -2059,6 +2018,7 @@
           <w:i w:val="0"/>
           <w:color w:val="334155"/>
           <w:sz w:val="22"/>
+          <w:u w:val="none"/>
         </w:rPr>
         <w:t>Semantic HTML5 Pages with Accessibility-Ready Structure</w:t>
       </w:r>
@@ -2076,6 +2036,7 @@
           <w:i w:val="0"/>
           <w:color w:val="475569"/>
           <w:sz w:val="26"/>
+          <w:u w:val="none"/>
         </w:rPr>
         <w:t>PROBLEM DEFINITION</w:t>
       </w:r>
@@ -2091,6 +2052,7 @@
           <w:i w:val="0"/>
           <w:color w:val="334155"/>
           <w:sz w:val="22"/>
+          <w:u w:val="none"/>
         </w:rPr>
         <w:t>Develop static HTML5 skeletons for at least 10 StudentHub pages such as Home, About, Register, Login, Dashboard, Events, Profile, Contact, Admin, FAQ, and Feedback. Use semantic tags and accessibility-friendly structure.</w:t>
       </w:r>
@@ -2108,6 +2070,7 @@
           <w:i w:val="0"/>
           <w:color w:val="475569"/>
           <w:sz w:val="26"/>
+          <w:u w:val="none"/>
         </w:rPr>
         <w:t>KEY QUESTIONS &amp; INTERPRETATION</w:t>
       </w:r>
@@ -2123,6 +2086,7 @@
           <w:i w:val="0"/>
           <w:color w:val="334155"/>
           <w:sz w:val="22"/>
+          <w:u w:val="none"/>
         </w:rPr>
         <w:t>Q1: Are semantic tags such as &lt;header&gt;, &lt;nav&gt;, &lt;main&gt;, &lt;section&gt;, &lt;article&gt;, &lt;aside&gt;, and &lt;footer&gt; used properly?</w:t>
         <w:br/>
@@ -2154,6 +2118,7 @@
           <w:i w:val="0"/>
           <w:color w:val="334155"/>
           <w:sz w:val="22"/>
+          <w:u w:val="none"/>
         </w:rPr>
         <w:t>Q2: Are form labels, headings, image alt text, and navigation links accessible?</w:t>
         <w:br/>
@@ -2179,6 +2144,7 @@
           <w:i w:val="0"/>
           <w:color w:val="334155"/>
           <w:sz w:val="22"/>
+          <w:u w:val="none"/>
         </w:rPr>
         <w:t>Q3: Is the page structure consistent across all pages?</w:t>
         <w:br/>
@@ -2198,6 +2164,7 @@
           <w:i w:val="0"/>
           <w:color w:val="475569"/>
           <w:sz w:val="26"/>
+          <w:u w:val="none"/>
         </w:rPr>
         <w:t>ACCESSIBILITY CHECKLIST IMPLEMENTED</w:t>
       </w:r>
@@ -2213,6 +2180,7 @@
           <w:i w:val="0"/>
           <w:color w:val="334155"/>
           <w:sz w:val="22"/>
+          <w:u w:val="none"/>
         </w:rPr>
         <w:t>✓ Skip-to-Content: A skip-to-content link exists as the very first child of &lt;body&gt; on all 11 pages.</w:t>
         <w:br/>
@@ -2246,6 +2214,7 @@
           <w:i w:val="0"/>
           <w:color w:val="475569"/>
           <w:sz w:val="26"/>
+          <w:u w:val="none"/>
         </w:rPr>
         <w:t>IMPLEMENTATION CODE (All 11 Pages)</w:t>
       </w:r>
@@ -2263,6 +2232,7 @@
           <w:i w:val="0"/>
           <w:color w:val="64748B"/>
           <w:sz w:val="22"/>
+          <w:u w:val="none"/>
         </w:rPr>
         <w:t>Source Code: index.html (Home Page)</w:t>
       </w:r>
@@ -2300,6 +2270,7 @@
                 <w:i w:val="0"/>
                 <w:color w:val="0F172A"/>
                 <w:sz w:val="18"/>
+                <w:u w:val="none"/>
               </w:rPr>
               <w:t>&lt;!DOCTYPE html&gt;</w:t>
               <w:br/>
@@ -2633,6 +2604,7 @@
           <w:i w:val="0"/>
           <w:color w:val="64748B"/>
           <w:sz w:val="22"/>
+          <w:u w:val="none"/>
         </w:rPr>
         <w:t>Source Code: pages/about.html (About Us Page)</w:t>
       </w:r>
@@ -2670,6 +2642,7 @@
                 <w:i w:val="0"/>
                 <w:color w:val="0F172A"/>
                 <w:sz w:val="18"/>
+                <w:u w:val="none"/>
               </w:rPr>
               <w:t>&lt;!DOCTYPE html&gt;</w:t>
               <w:br/>
@@ -3062,6 +3035,7 @@
           <w:i w:val="0"/>
           <w:color w:val="64748B"/>
           <w:sz w:val="22"/>
+          <w:u w:val="none"/>
         </w:rPr>
         <w:t>Source Code: pages/register.html (Student Registration Page)</w:t>
       </w:r>
@@ -3099,6 +3073,7 @@
                 <w:i w:val="0"/>
                 <w:color w:val="0F172A"/>
                 <w:sz w:val="18"/>
+                <w:u w:val="none"/>
               </w:rPr>
               <w:t>&lt;!DOCTYPE html&gt;</w:t>
               <w:br/>
@@ -3650,6 +3625,7 @@
           <w:i w:val="0"/>
           <w:color w:val="64748B"/>
           <w:sz w:val="22"/>
+          <w:u w:val="none"/>
         </w:rPr>
         <w:t>Source Code: pages/login.html (User Login Page)</w:t>
       </w:r>
@@ -3687,6 +3663,7 @@
                 <w:i w:val="0"/>
                 <w:color w:val="0F172A"/>
                 <w:sz w:val="18"/>
+                <w:u w:val="none"/>
               </w:rPr>
               <w:t>&lt;!DOCTYPE html&gt;</w:t>
               <w:br/>
@@ -3937,6 +3914,7 @@
           <w:i w:val="0"/>
           <w:color w:val="64748B"/>
           <w:sz w:val="22"/>
+          <w:u w:val="none"/>
         </w:rPr>
         <w:t>Source Code: pages/dashboard.html (Student Dashboard Page)</w:t>
       </w:r>
@@ -3974,6 +3952,7 @@
                 <w:i w:val="0"/>
                 <w:color w:val="0F172A"/>
                 <w:sz w:val="18"/>
+                <w:u w:val="none"/>
               </w:rPr>
               <w:t>&lt;!DOCTYPE html&gt;</w:t>
               <w:br/>
@@ -4386,6 +4365,7 @@
           <w:i w:val="0"/>
           <w:color w:val="64748B"/>
           <w:sz w:val="22"/>
+          <w:u w:val="none"/>
         </w:rPr>
         <w:t>Source Code: pages/events.html (Campus Events Page)</w:t>
       </w:r>
@@ -4423,6 +4403,7 @@
                 <w:i w:val="0"/>
                 <w:color w:val="0F172A"/>
                 <w:sz w:val="18"/>
+                <w:u w:val="none"/>
               </w:rPr>
               <w:t>&lt;!DOCTYPE html&gt;</w:t>
               <w:br/>
@@ -4832,6 +4813,7 @@
           <w:i w:val="0"/>
           <w:color w:val="64748B"/>
           <w:sz w:val="22"/>
+          <w:u w:val="none"/>
         </w:rPr>
         <w:t>Source Code: pages/profile.html (Student Profile Page)</w:t>
       </w:r>
@@ -4869,6 +4851,7 @@
                 <w:i w:val="0"/>
                 <w:color w:val="0F172A"/>
                 <w:sz w:val="18"/>
+                <w:u w:val="none"/>
               </w:rPr>
               <w:t>&lt;!DOCTYPE html&gt;</w:t>
               <w:br/>
@@ -5265,6 +5248,7 @@
           <w:i w:val="0"/>
           <w:color w:val="64748B"/>
           <w:sz w:val="22"/>
+          <w:u w:val="none"/>
         </w:rPr>
         <w:t>Source Code: pages/contact.html (Contact Support Page)</w:t>
       </w:r>
@@ -5302,6 +5286,7 @@
                 <w:i w:val="0"/>
                 <w:color w:val="0F172A"/>
                 <w:sz w:val="18"/>
+                <w:u w:val="none"/>
               </w:rPr>
               <w:t>&lt;!DOCTYPE html&gt;</w:t>
               <w:br/>
@@ -5715,6 +5700,7 @@
           <w:i w:val="0"/>
           <w:color w:val="64748B"/>
           <w:sz w:val="22"/>
+          <w:u w:val="none"/>
         </w:rPr>
         <w:t>Source Code: pages/admin.html (Admin Portal Page)</w:t>
       </w:r>
@@ -5752,6 +5738,7 @@
                 <w:i w:val="0"/>
                 <w:color w:val="0F172A"/>
                 <w:sz w:val="18"/>
+                <w:u w:val="none"/>
               </w:rPr>
               <w:t>&lt;!DOCTYPE html&gt;</w:t>
               <w:br/>
@@ -6096,6 +6083,7 @@
           <w:i w:val="0"/>
           <w:color w:val="64748B"/>
           <w:sz w:val="22"/>
+          <w:u w:val="none"/>
         </w:rPr>
         <w:t>Source Code: pages/faq.html (FAQ Page)</w:t>
       </w:r>
@@ -6133,6 +6121,7 @@
                 <w:i w:val="0"/>
                 <w:color w:val="0F172A"/>
                 <w:sz w:val="18"/>
+                <w:u w:val="none"/>
               </w:rPr>
               <w:t>&lt;!DOCTYPE html&gt;</w:t>
               <w:br/>
@@ -6446,6 +6435,7 @@
           <w:i w:val="0"/>
           <w:color w:val="64748B"/>
           <w:sz w:val="22"/>
+          <w:u w:val="none"/>
         </w:rPr>
         <w:t>Source Code: pages/feedback.html (Feedback Survey Page)</w:t>
       </w:r>
@@ -6483,6 +6473,7 @@
                 <w:i w:val="0"/>
                 <w:color w:val="0F172A"/>
                 <w:sz w:val="18"/>
+                <w:u w:val="none"/>
               </w:rPr>
               <w:t>&lt;!DOCTYPE html&gt;</w:t>
               <w:br/>
@@ -6867,6 +6858,7 @@
           <w:i w:val="0"/>
           <w:color w:val="475569"/>
           <w:sz w:val="26"/>
+          <w:u w:val="none"/>
         </w:rPr>
         <w:t>OUTPUT SCREENSHOTS &amp; PASTING INSTRUCTIONS</w:t>
       </w:r>
@@ -6884,8 +6876,107 @@
           <w:i w:val="0"/>
           <w:color w:val="64748B"/>
           <w:sz w:val="22"/>
+          <w:u w:val="none"/>
         </w:rPr>
         <w:t>Output Slot: Home Page (index.html)</w:t>
+      </w:r>
+    </w:p>
+    <w:tbl>
+      <w:tblPr>
+        <w:tblW w:type="auto" w:w="0"/>
+        <w:jc w:val="center"/>
+        <w:tblLook w:firstColumn="1" w:firstRow="1" w:lastColumn="0" w:lastRow="0" w:noHBand="0" w:noVBand="1" w:val="04A0"/>
+      </w:tblPr>
+      <w:tblGrid>
+        <w:gridCol w:w="9360"/>
+      </w:tblGrid>
+      <w:tr>
+        <w:tc>
+          <w:tcPr>
+            <w:tcW w:type="dxa" w:w="9360"/>
+            <w:tcBorders>
+              <w:top w:val="single" w:sz="4" w:space="0" w:color="F1F5F9"/>
+              <w:left w:val="single" w:sz="4" w:space="0" w:color="F1F5F9"/>
+              <w:bottom w:val="single" w:sz="4" w:space="0" w:color="F1F5F9"/>
+              <w:right w:val="single" w:sz="4" w:space="0" w:color="F1F5F9"/>
+            </w:tcBorders>
+          </w:tcPr>
+          <w:p>
+            <w:pPr>
+              <w:spacing w:before="160" w:after="160"/>
+              <w:jc w:val="center"/>
+            </w:pPr>
+            <w:r>
+              <w:drawing>
+                <wp:inline xmlns:a="http://schemas.openxmlformats.org/drawingml/2006/main" xmlns:pic="http://schemas.openxmlformats.org/drawingml/2006/picture">
+                  <wp:extent cx="5303520" cy="4242816"/>
+                  <wp:docPr id="17" name="Picture 17"/>
+                  <wp:cNvGraphicFramePr>
+                    <a:graphicFrameLocks noChangeAspect="1"/>
+                  </wp:cNvGraphicFramePr>
+                  <a:graphic>
+                    <a:graphicData uri="http://schemas.openxmlformats.org/drawingml/2006/picture">
+                      <pic:pic>
+                        <pic:nvPicPr>
+                          <pic:cNvPr id="0" name="01_index_screenshot.png"/>
+                          <pic:cNvPicPr/>
+                        </pic:nvPicPr>
+                        <pic:blipFill>
+                          <a:blip r:embed="rId27"/>
+                          <a:stretch>
+                            <a:fillRect/>
+                          </a:stretch>
+                        </pic:blipFill>
+                        <pic:spPr>
+                          <a:xfrm>
+                            <a:off x="0" y="0"/>
+                            <a:ext cx="5303520" cy="4242816"/>
+                          </a:xfrm>
+                          <a:prstGeom prst="rect"/>
+                        </pic:spPr>
+                      </pic:pic>
+                    </a:graphicData>
+                  </a:graphic>
+                </wp:inline>
+              </w:drawing>
+            </w:r>
+          </w:p>
+        </w:tc>
+      </w:tr>
+    </w:tbl>
+    <w:p>
+      <w:pPr>
+        <w:spacing w:before="80" w:after="240"/>
+        <w:jc w:val="center"/>
+      </w:pPr>
+      <w:r>
+        <w:rPr>
+          <w:rFonts w:ascii="Calibri" w:hAnsi="Calibri"/>
+          <w:b w:val="0"/>
+          <w:i/>
+          <w:color w:val="64748B"/>
+          <w:sz w:val="19"/>
+          <w:u w:val="none"/>
+        </w:rPr>
+        <w:t>Figure: Browser rendering for Home Page</w:t>
+      </w:r>
+    </w:p>
+    <w:p>
+      <w:pPr>
+        <w:pStyle w:val="Heading3"/>
+        <w:keepNext/>
+        <w:spacing w:before="240" w:after="120"/>
+      </w:pPr>
+      <w:r>
+        <w:rPr>
+          <w:rFonts w:ascii="Calibri Light" w:hAnsi="Calibri Light"/>
+          <w:b/>
+          <w:i w:val="0"/>
+          <w:color w:val="64748B"/>
+          <w:sz w:val="22"/>
+          <w:u w:val="none"/>
+        </w:rPr>
+        <w:t>Output Slot: About Us Page (about.html)</w:t>
       </w:r>
     </w:p>
     <w:tbl>
@@ -6925,7 +7016,7 @@
                     <a:graphicData uri="http://schemas.openxmlformats.org/drawingml/2006/picture">
                       <pic:pic>
                         <pic:nvPicPr>
-                          <pic:cNvPr id="0" name="01_index_screenshot.png"/>
+                          <pic:cNvPr id="0" name="02_about_screenshot.png"/>
                           <pic:cNvPicPr/>
                         </pic:nvPicPr>
                         <pic:blipFill>
@@ -6963,8 +7054,9 @@
           <w:i/>
           <w:color w:val="64748B"/>
           <w:sz w:val="19"/>
+          <w:u w:val="none"/>
         </w:rPr>
-        <w:t>Figure: Browser rendering for Home Page</w:t>
+        <w:t>Figure: Browser rendering for About Us Page</w:t>
       </w:r>
     </w:p>
     <w:p>
@@ -6980,8 +7072,9 @@
           <w:i w:val="0"/>
           <w:color w:val="64748B"/>
           <w:sz w:val="22"/>
+          <w:u w:val="none"/>
         </w:rPr>
-        <w:t>Output Slot: About Us Page (about.html)</w:t>
+        <w:t>Output Slot: Student Registration Page (register.html)</w:t>
       </w:r>
     </w:p>
     <w:tbl>
@@ -7021,7 +7114,7 @@
                     <a:graphicData uri="http://schemas.openxmlformats.org/drawingml/2006/picture">
                       <pic:pic>
                         <pic:nvPicPr>
-                          <pic:cNvPr id="0" name="02_about_screenshot.png"/>
+                          <pic:cNvPr id="0" name="03_register_screenshot.png"/>
                           <pic:cNvPicPr/>
                         </pic:nvPicPr>
                         <pic:blipFill>
@@ -7059,8 +7152,9 @@
           <w:i/>
           <w:color w:val="64748B"/>
           <w:sz w:val="19"/>
+          <w:u w:val="none"/>
         </w:rPr>
-        <w:t>Figure: Browser rendering for About Us Page</w:t>
+        <w:t>Figure: Browser rendering for Student Registration Page</w:t>
       </w:r>
     </w:p>
     <w:p>
@@ -7076,8 +7170,9 @@
           <w:i w:val="0"/>
           <w:color w:val="64748B"/>
           <w:sz w:val="22"/>
+          <w:u w:val="none"/>
         </w:rPr>
-        <w:t>Output Slot: Student Registration Page (register.html)</w:t>
+        <w:t>Output Slot: User Login Page (login.html)</w:t>
       </w:r>
     </w:p>
     <w:tbl>
@@ -7117,7 +7212,7 @@
                     <a:graphicData uri="http://schemas.openxmlformats.org/drawingml/2006/picture">
                       <pic:pic>
                         <pic:nvPicPr>
-                          <pic:cNvPr id="0" name="03_register_screenshot.png"/>
+                          <pic:cNvPr id="0" name="04_login_screenshot.png"/>
                           <pic:cNvPicPr/>
                         </pic:nvPicPr>
                         <pic:blipFill>
@@ -7155,8 +7250,9 @@
           <w:i/>
           <w:color w:val="64748B"/>
           <w:sz w:val="19"/>
+          <w:u w:val="none"/>
         </w:rPr>
-        <w:t>Figure: Browser rendering for Student Registration Page</w:t>
+        <w:t>Figure: Browser rendering for User Login Page</w:t>
       </w:r>
     </w:p>
     <w:p>
@@ -7172,8 +7268,9 @@
           <w:i w:val="0"/>
           <w:color w:val="64748B"/>
           <w:sz w:val="22"/>
+          <w:u w:val="none"/>
         </w:rPr>
-        <w:t>Output Slot: User Login Page (login.html)</w:t>
+        <w:t>Output Slot: Student Dashboard Page (dashboard.html)</w:t>
       </w:r>
     </w:p>
     <w:tbl>
@@ -7213,7 +7310,7 @@
                     <a:graphicData uri="http://schemas.openxmlformats.org/drawingml/2006/picture">
                       <pic:pic>
                         <pic:nvPicPr>
-                          <pic:cNvPr id="0" name="04_login_screenshot.png"/>
+                          <pic:cNvPr id="0" name="05_dashboard_screenshot.png"/>
                           <pic:cNvPicPr/>
                         </pic:nvPicPr>
                         <pic:blipFill>
@@ -7251,8 +7348,9 @@
           <w:i/>
           <w:color w:val="64748B"/>
           <w:sz w:val="19"/>
+          <w:u w:val="none"/>
         </w:rPr>
-        <w:t>Figure: Browser rendering for User Login Page</w:t>
+        <w:t>Figure: Browser rendering for Student Dashboard Page</w:t>
       </w:r>
     </w:p>
     <w:p>
@@ -7268,8 +7366,9 @@
           <w:i w:val="0"/>
           <w:color w:val="64748B"/>
           <w:sz w:val="22"/>
+          <w:u w:val="none"/>
         </w:rPr>
-        <w:t>Output Slot: Student Dashboard Page (dashboard.html)</w:t>
+        <w:t>Output Slot: Campus Events Page (events.html)</w:t>
       </w:r>
     </w:p>
     <w:tbl>
@@ -7309,7 +7408,7 @@
                     <a:graphicData uri="http://schemas.openxmlformats.org/drawingml/2006/picture">
                       <pic:pic>
                         <pic:nvPicPr>
-                          <pic:cNvPr id="0" name="05_dashboard_screenshot.png"/>
+                          <pic:cNvPr id="0" name="06_events_screenshot.png"/>
                           <pic:cNvPicPr/>
                         </pic:nvPicPr>
                         <pic:blipFill>
@@ -7347,8 +7446,9 @@
           <w:i/>
           <w:color w:val="64748B"/>
           <w:sz w:val="19"/>
+          <w:u w:val="none"/>
         </w:rPr>
-        <w:t>Figure: Browser rendering for Student Dashboard Page</w:t>
+        <w:t>Figure: Browser rendering for Campus Events Page</w:t>
       </w:r>
     </w:p>
     <w:p>
@@ -7364,8 +7464,9 @@
           <w:i w:val="0"/>
           <w:color w:val="64748B"/>
           <w:sz w:val="22"/>
+          <w:u w:val="none"/>
         </w:rPr>
-        <w:t>Output Slot: Campus Events Page (events.html)</w:t>
+        <w:t>Output Slot: Student Profile Page (profile.html)</w:t>
       </w:r>
     </w:p>
     <w:tbl>
@@ -7405,7 +7506,7 @@
                     <a:graphicData uri="http://schemas.openxmlformats.org/drawingml/2006/picture">
                       <pic:pic>
                         <pic:nvPicPr>
-                          <pic:cNvPr id="0" name="06_events_screenshot.png"/>
+                          <pic:cNvPr id="0" name="07_profile_screenshot.png"/>
                           <pic:cNvPicPr/>
                         </pic:nvPicPr>
                         <pic:blipFill>
@@ -7443,8 +7544,9 @@
           <w:i/>
           <w:color w:val="64748B"/>
           <w:sz w:val="19"/>
+          <w:u w:val="none"/>
         </w:rPr>
-        <w:t>Figure: Browser rendering for Campus Events Page</w:t>
+        <w:t>Figure: Browser rendering for Student Profile Page</w:t>
       </w:r>
     </w:p>
     <w:p>
@@ -7460,8 +7562,9 @@
           <w:i w:val="0"/>
           <w:color w:val="64748B"/>
           <w:sz w:val="22"/>
+          <w:u w:val="none"/>
         </w:rPr>
-        <w:t>Output Slot: Student Profile Page (profile.html)</w:t>
+        <w:t>Output Slot: Contact Support Page (contact.html)</w:t>
       </w:r>
     </w:p>
     <w:tbl>
@@ -7501,7 +7604,7 @@
                     <a:graphicData uri="http://schemas.openxmlformats.org/drawingml/2006/picture">
                       <pic:pic>
                         <pic:nvPicPr>
-                          <pic:cNvPr id="0" name="07_profile_screenshot.png"/>
+                          <pic:cNvPr id="0" name="08_contact_screenshot.png"/>
                           <pic:cNvPicPr/>
                         </pic:nvPicPr>
                         <pic:blipFill>
@@ -7539,8 +7642,9 @@
           <w:i/>
           <w:color w:val="64748B"/>
           <w:sz w:val="19"/>
+          <w:u w:val="none"/>
         </w:rPr>
-        <w:t>Figure: Browser rendering for Student Profile Page</w:t>
+        <w:t>Figure: Browser rendering for Contact Support Page</w:t>
       </w:r>
     </w:p>
     <w:p>
@@ -7556,8 +7660,9 @@
           <w:i w:val="0"/>
           <w:color w:val="64748B"/>
           <w:sz w:val="22"/>
+          <w:u w:val="none"/>
         </w:rPr>
-        <w:t>Output Slot: Contact Support Page (contact.html)</w:t>
+        <w:t>Output Slot: Admin Portal Page (admin.html)</w:t>
       </w:r>
     </w:p>
     <w:tbl>
@@ -7597,7 +7702,7 @@
                     <a:graphicData uri="http://schemas.openxmlformats.org/drawingml/2006/picture">
                       <pic:pic>
                         <pic:nvPicPr>
-                          <pic:cNvPr id="0" name="08_contact_screenshot.png"/>
+                          <pic:cNvPr id="0" name="09_admin_screenshot.png"/>
                           <pic:cNvPicPr/>
                         </pic:nvPicPr>
                         <pic:blipFill>
@@ -7635,8 +7740,9 @@
           <w:i/>
           <w:color w:val="64748B"/>
           <w:sz w:val="19"/>
+          <w:u w:val="none"/>
         </w:rPr>
-        <w:t>Figure: Browser rendering for Contact Support Page</w:t>
+        <w:t>Figure: Browser rendering for Admin Portal Page</w:t>
       </w:r>
     </w:p>
     <w:p>
@@ -7652,8 +7758,9 @@
           <w:i w:val="0"/>
           <w:color w:val="64748B"/>
           <w:sz w:val="22"/>
+          <w:u w:val="none"/>
         </w:rPr>
-        <w:t>Output Slot: Admin Portal Page (admin.html)</w:t>
+        <w:t>Output Slot: FAQ Page (faq.html)</w:t>
       </w:r>
     </w:p>
     <w:tbl>
@@ -7693,7 +7800,7 @@
                     <a:graphicData uri="http://schemas.openxmlformats.org/drawingml/2006/picture">
                       <pic:pic>
                         <pic:nvPicPr>
-                          <pic:cNvPr id="0" name="09_admin_screenshot.png"/>
+                          <pic:cNvPr id="0" name="10_faq_screenshot.png"/>
                           <pic:cNvPicPr/>
                         </pic:nvPicPr>
                         <pic:blipFill>
@@ -7731,8 +7838,9 @@
           <w:i/>
           <w:color w:val="64748B"/>
           <w:sz w:val="19"/>
+          <w:u w:val="none"/>
         </w:rPr>
-        <w:t>Figure: Browser rendering for Admin Portal Page</w:t>
+        <w:t>Figure: Browser rendering for FAQ Page</w:t>
       </w:r>
     </w:p>
     <w:p>
@@ -7748,8 +7856,9 @@
           <w:i w:val="0"/>
           <w:color w:val="64748B"/>
           <w:sz w:val="22"/>
+          <w:u w:val="none"/>
         </w:rPr>
-        <w:t>Output Slot: FAQ Page (faq.html)</w:t>
+        <w:t>Output Slot: Feedback Survey Page (feedback.html)</w:t>
       </w:r>
     </w:p>
     <w:tbl>
@@ -7789,7 +7898,7 @@
                     <a:graphicData uri="http://schemas.openxmlformats.org/drawingml/2006/picture">
                       <pic:pic>
                         <pic:nvPicPr>
-                          <pic:cNvPr id="0" name="10_faq_screenshot.png"/>
+                          <pic:cNvPr id="0" name="11_feedback_screenshot.png"/>
                           <pic:cNvPicPr/>
                         </pic:nvPicPr>
                         <pic:blipFill>
@@ -7827,8 +7936,9 @@
           <w:i/>
           <w:color w:val="64748B"/>
           <w:sz w:val="19"/>
+          <w:u w:val="none"/>
         </w:rPr>
-        <w:t>Figure: Browser rendering for FAQ Page</w:t>
+        <w:t>Figure: Browser rendering for Feedback Survey Page</w:t>
       </w:r>
     </w:p>
     <w:p>
@@ -7844,8 +7954,9 @@
           <w:i w:val="0"/>
           <w:color w:val="64748B"/>
           <w:sz w:val="22"/>
+          <w:u w:val="none"/>
         </w:rPr>
-        <w:t>Output Slot: Feedback Survey Page (feedback.html)</w:t>
+        <w:t>Output Slot: Accessibility Keyboard Navigation &amp; Focus State Verification</w:t>
       </w:r>
     </w:p>
     <w:tbl>
@@ -7885,7 +7996,7 @@
                     <a:graphicData uri="http://schemas.openxmlformats.org/drawingml/2006/picture">
                       <pic:pic>
                         <pic:nvPicPr>
-                          <pic:cNvPr id="0" name="11_feedback_screenshot.png"/>
+                          <pic:cNvPr id="0" name="12_accessibility_screenshot.png"/>
                           <pic:cNvPicPr/>
                         </pic:nvPicPr>
                         <pic:blipFill>
@@ -7923,102 +8034,7 @@
           <w:i/>
           <w:color w:val="64748B"/>
           <w:sz w:val="19"/>
-        </w:rPr>
-        <w:t>Figure: Browser rendering for Feedback Survey Page</w:t>
-      </w:r>
-    </w:p>
-    <w:p>
-      <w:pPr>
-        <w:pStyle w:val="Heading3"/>
-        <w:keepNext/>
-        <w:spacing w:before="240" w:after="120"/>
-      </w:pPr>
-      <w:r>
-        <w:rPr>
-          <w:rFonts w:ascii="Calibri Light" w:hAnsi="Calibri Light"/>
-          <w:b/>
-          <w:i w:val="0"/>
-          <w:color w:val="64748B"/>
-          <w:sz w:val="22"/>
-        </w:rPr>
-        <w:t>Output Slot: Accessibility Keyboard Navigation &amp; Focus State Verification</w:t>
-      </w:r>
-    </w:p>
-    <w:tbl>
-      <w:tblPr>
-        <w:tblW w:type="auto" w:w="0"/>
-        <w:jc w:val="center"/>
-        <w:tblLook w:firstColumn="1" w:firstRow="1" w:lastColumn="0" w:lastRow="0" w:noHBand="0" w:noVBand="1" w:val="04A0"/>
-      </w:tblPr>
-      <w:tblGrid>
-        <w:gridCol w:w="9360"/>
-      </w:tblGrid>
-      <w:tr>
-        <w:tc>
-          <w:tcPr>
-            <w:tcW w:type="dxa" w:w="9360"/>
-            <w:tcBorders>
-              <w:top w:val="single" w:sz="4" w:space="0" w:color="F1F5F9"/>
-              <w:left w:val="single" w:sz="4" w:space="0" w:color="F1F5F9"/>
-              <w:bottom w:val="single" w:sz="4" w:space="0" w:color="F1F5F9"/>
-              <w:right w:val="single" w:sz="4" w:space="0" w:color="F1F5F9"/>
-            </w:tcBorders>
-          </w:tcPr>
-          <w:p>
-            <w:pPr>
-              <w:spacing w:before="160" w:after="160"/>
-              <w:jc w:val="center"/>
-            </w:pPr>
-            <w:r>
-              <w:drawing>
-                <wp:inline xmlns:a="http://schemas.openxmlformats.org/drawingml/2006/main" xmlns:pic="http://schemas.openxmlformats.org/drawingml/2006/picture">
-                  <wp:extent cx="5303520" cy="4242816"/>
-                  <wp:docPr id="29" name="Picture 29"/>
-                  <wp:cNvGraphicFramePr>
-                    <a:graphicFrameLocks noChangeAspect="1"/>
-                  </wp:cNvGraphicFramePr>
-                  <a:graphic>
-                    <a:graphicData uri="http://schemas.openxmlformats.org/drawingml/2006/picture">
-                      <pic:pic>
-                        <pic:nvPicPr>
-                          <pic:cNvPr id="0" name="12_accessibility_screenshot.png"/>
-                          <pic:cNvPicPr/>
-                        </pic:nvPicPr>
-                        <pic:blipFill>
-                          <a:blip r:embed="rId39"/>
-                          <a:stretch>
-                            <a:fillRect/>
-                          </a:stretch>
-                        </pic:blipFill>
-                        <pic:spPr>
-                          <a:xfrm>
-                            <a:off x="0" y="0"/>
-                            <a:ext cx="5303520" cy="4242816"/>
-                          </a:xfrm>
-                          <a:prstGeom prst="rect"/>
-                        </pic:spPr>
-                      </pic:pic>
-                    </a:graphicData>
-                  </a:graphic>
-                </wp:inline>
-              </w:drawing>
-            </w:r>
-          </w:p>
-        </w:tc>
-      </w:tr>
-    </w:tbl>
-    <w:p>
-      <w:pPr>
-        <w:spacing w:before="80" w:after="240"/>
-        <w:jc w:val="center"/>
-      </w:pPr>
-      <w:r>
-        <w:rPr>
-          <w:rFonts w:ascii="Calibri" w:hAnsi="Calibri"/>
-          <w:b w:val="0"/>
-          <w:i/>
-          <w:color w:val="64748B"/>
-          <w:sz w:val="19"/>
+          <w:u w:val="none"/>
         </w:rPr>
         <w:t>Figure: Skip link focused with default browser outline verifying keyboard navigation functionality</w:t>
       </w:r>
@@ -8041,8 +8057,10 @@
     <w:pPr>
       <w:pStyle w:val="Footer"/>
       <w:tabs>
-        <w:tab w:pos="9360" w:val="right"/>
+        <w:tab w:pos="1440" w:val="left"/>
+        <w:tab w:pos="10800" w:val="right"/>
       </w:tabs>
+      <w:ind w:left="-1440" w:right="-1440"/>
       <w:pBdr>
         <w:top w:val="single" w:sz="6" w:space="4" w:color="CBD5E1"/>
       </w:pBdr>
@@ -8053,8 +8071,10 @@
         <w:b w:val="0"/>
         <w:i w:val="0"/>
         <w:color w:val="64748B"/>
-        <w:sz w:val="17"/>
-      </w:rPr>
+        <w:sz w:val="21"/>
+        <w:u w:val="none"/>
+      </w:rPr>
+      <w:tab/>
       <w:t>DEPSTAR CSE</w:t>
       <w:tab/>
     </w:r>
@@ -8064,7 +8084,8 @@
         <w:b w:val="0"/>
         <w:i w:val="0"/>
         <w:color w:val="64748B"/>
-        <w:sz w:val="17"/>
+        <w:sz w:val="21"/>
+        <w:u w:val="none"/>
       </w:rPr>
       <w:t xml:space="preserve">PAGE NO. </w:t>
       <w:fldChar w:fldCharType="begin"/>
@@ -8082,8 +8103,10 @@
     <w:pPr>
       <w:pStyle w:val="Header"/>
       <w:tabs>
-        <w:tab w:pos="9360" w:val="right"/>
+        <w:tab w:pos="1440" w:val="left"/>
+        <w:tab w:pos="10800" w:val="right"/>
       </w:tabs>
+      <w:ind w:left="-1440" w:right="-1440"/>
       <w:pBdr>
         <w:bottom w:val="single" w:sz="6" w:space="4" w:color="CBD5E1"/>
       </w:pBdr>
@@ -8094,8 +8117,10 @@
         <w:b w:val="0"/>
         <w:i w:val="0"/>
         <w:color w:val="64748B"/>
-        <w:sz w:val="17"/>
-      </w:rPr>
+        <w:sz w:val="21"/>
+        <w:u w:val="none"/>
+      </w:rPr>
+      <w:tab/>
       <w:t>ITUE203- WEB DEVELOPMENT FRAMEWORKS</w:t>
       <w:tab/>
       <w:t>25DCS058</w:t>

</xml_diff>